<commit_message>
Update detail project background
</commit_message>
<xml_diff>
--- a/[SRS] Zynergy Web App v0.1.docx
+++ b/[SRS] Zynergy Web App v0.1.docx
@@ -3160,7 +3160,7 @@
                 <w:noProof/>
                 <w:webHidden/>
               </w:rPr>
-              <w:t>11</w:t>
+              <w:t>12</w:t>
             </w:r>
             <w:r>
               <w:rPr>
@@ -3256,7 +3256,7 @@
                 <w:noProof/>
                 <w:webHidden/>
               </w:rPr>
-              <w:t>11</w:t>
+              <w:t>12</w:t>
             </w:r>
             <w:r>
               <w:rPr>
@@ -3544,7 +3544,7 @@
                 <w:noProof/>
                 <w:webHidden/>
               </w:rPr>
-              <w:t>13</w:t>
+              <w:t>20</w:t>
             </w:r>
             <w:r>
               <w:rPr>
@@ -3640,7 +3640,7 @@
                 <w:noProof/>
                 <w:webHidden/>
               </w:rPr>
-              <w:t>13</w:t>
+              <w:t>20</w:t>
             </w:r>
             <w:r>
               <w:rPr>
@@ -3736,7 +3736,7 @@
                 <w:noProof/>
                 <w:webHidden/>
               </w:rPr>
-              <w:t>14</w:t>
+              <w:t>21</w:t>
             </w:r>
             <w:r>
               <w:rPr>
@@ -3832,7 +3832,7 @@
                 <w:noProof/>
                 <w:webHidden/>
               </w:rPr>
-              <w:t>14</w:t>
+              <w:t>21</w:t>
             </w:r>
             <w:r>
               <w:rPr>
@@ -3928,7 +3928,7 @@
                 <w:noProof/>
                 <w:webHidden/>
               </w:rPr>
-              <w:t>14</w:t>
+              <w:t>21</w:t>
             </w:r>
             <w:r>
               <w:rPr>
@@ -4024,7 +4024,7 @@
                 <w:noProof/>
                 <w:webHidden/>
               </w:rPr>
-              <w:t>15</w:t>
+              <w:t>22</w:t>
             </w:r>
             <w:r>
               <w:rPr>
@@ -4120,7 +4120,7 @@
                 <w:noProof/>
                 <w:webHidden/>
               </w:rPr>
-              <w:t>17</w:t>
+              <w:t>24</w:t>
             </w:r>
             <w:r>
               <w:rPr>
@@ -4195,7 +4195,7 @@
                 <w:noProof/>
                 <w:webHidden/>
               </w:rPr>
-              <w:t>17</w:t>
+              <w:t>24</w:t>
             </w:r>
             <w:r>
               <w:rPr>
@@ -4270,7 +4270,7 @@
                 <w:noProof/>
                 <w:webHidden/>
               </w:rPr>
-              <w:t>18</w:t>
+              <w:t>25</w:t>
             </w:r>
             <w:r>
               <w:rPr>
@@ -4345,7 +4345,7 @@
                 <w:noProof/>
                 <w:webHidden/>
               </w:rPr>
-              <w:t>18</w:t>
+              <w:t>25</w:t>
             </w:r>
             <w:r>
               <w:rPr>
@@ -4420,7 +4420,7 @@
                 <w:noProof/>
                 <w:webHidden/>
               </w:rPr>
-              <w:t>19</w:t>
+              <w:t>26</w:t>
             </w:r>
             <w:r>
               <w:rPr>
@@ -4495,7 +4495,7 @@
                 <w:noProof/>
                 <w:webHidden/>
               </w:rPr>
-              <w:t>19</w:t>
+              <w:t>26</w:t>
             </w:r>
             <w:r>
               <w:rPr>
@@ -4570,7 +4570,7 @@
                 <w:noProof/>
                 <w:webHidden/>
               </w:rPr>
-              <w:t>19</w:t>
+              <w:t>26</w:t>
             </w:r>
             <w:r>
               <w:rPr>
@@ -5170,7 +5170,7 @@
                 <w:color w:val="000000" w:themeColor="text1"/>
                 <w:lang w:eastAsia="en-ID"/>
               </w:rPr>
-              <w:t>V0.</w:t>
+              <w:t>v</w:t>
             </w:r>
             <w:r>
               <w:rPr>
@@ -5178,7 +5178,15 @@
                 <w:color w:val="000000" w:themeColor="text1"/>
                 <w:lang w:eastAsia="en-ID"/>
               </w:rPr>
-              <w:t>2</w:t>
+              <w:t>0.</w:t>
+            </w:r>
+            <w:r>
+              <w:rPr>
+                <w:rFonts w:ascii="Tahoma" w:eastAsia="Times New Roman" w:hAnsi="Tahoma" w:cs="Tahoma"/>
+                <w:color w:val="000000" w:themeColor="text1"/>
+                <w:lang w:eastAsia="en-ID"/>
+              </w:rPr>
+              <w:t>1</w:t>
             </w:r>
           </w:p>
         </w:tc>
@@ -5306,6 +5314,14 @@
                 <w:lang w:eastAsia="en-ID"/>
               </w:rPr>
             </w:pPr>
+            <w:r>
+              <w:rPr>
+                <w:rFonts w:ascii="Tahoma" w:eastAsia="Times New Roman" w:hAnsi="Tahoma" w:cs="Tahoma"/>
+                <w:color w:val="000000" w:themeColor="text1"/>
+                <w:lang w:eastAsia="en-ID"/>
+              </w:rPr>
+              <w:t>08 Oct 2026</w:t>
+            </w:r>
           </w:p>
         </w:tc>
         <w:tc>
@@ -5322,6 +5338,14 @@
                 <w:lang w:eastAsia="en-ID"/>
               </w:rPr>
             </w:pPr>
+            <w:r>
+              <w:rPr>
+                <w:rFonts w:ascii="Tahoma" w:eastAsia="Times New Roman" w:hAnsi="Tahoma" w:cs="Tahoma"/>
+                <w:color w:val="000000" w:themeColor="text1"/>
+                <w:lang w:eastAsia="en-ID"/>
+              </w:rPr>
+              <w:t>v0.1</w:t>
+            </w:r>
           </w:p>
         </w:tc>
         <w:tc>
@@ -5338,6 +5362,30 @@
                 <w:lang w:val="en-ID" w:eastAsia="en-ID"/>
               </w:rPr>
             </w:pPr>
+            <w:r>
+              <w:rPr>
+                <w:rFonts w:ascii="Tahoma" w:eastAsia="Times New Roman" w:hAnsi="Tahoma" w:cs="Tahoma"/>
+                <w:color w:val="000000" w:themeColor="text1"/>
+                <w:lang w:val="en-ID" w:eastAsia="en-ID"/>
+              </w:rPr>
+              <w:t xml:space="preserve">Update </w:t>
+            </w:r>
+            <w:r>
+              <w:rPr>
+                <w:rFonts w:ascii="Tahoma" w:eastAsia="Times New Roman" w:hAnsi="Tahoma" w:cs="Tahoma"/>
+                <w:color w:val="000000" w:themeColor="text1"/>
+                <w:lang w:val="en-ID" w:eastAsia="en-ID"/>
+              </w:rPr>
+              <w:t xml:space="preserve">Detail </w:t>
+            </w:r>
+            <w:r>
+              <w:rPr>
+                <w:rFonts w:ascii="Tahoma" w:eastAsia="Times New Roman" w:hAnsi="Tahoma" w:cs="Tahoma"/>
+                <w:color w:val="000000" w:themeColor="text1"/>
+                <w:lang w:val="en-ID" w:eastAsia="en-ID"/>
+              </w:rPr>
+              <w:t>project background</w:t>
+            </w:r>
           </w:p>
         </w:tc>
         <w:tc>
@@ -5354,6 +5402,14 @@
                 <w:lang w:val="en-ID" w:eastAsia="en-ID"/>
               </w:rPr>
             </w:pPr>
+            <w:r>
+              <w:rPr>
+                <w:rFonts w:ascii="Tahoma" w:eastAsia="Times New Roman" w:hAnsi="Tahoma" w:cs="Tahoma"/>
+                <w:color w:val="000000" w:themeColor="text1"/>
+                <w:lang w:val="en-ID" w:eastAsia="en-ID"/>
+              </w:rPr>
+              <w:t>Ansof</w:t>
+            </w:r>
           </w:p>
         </w:tc>
         <w:tc>
@@ -5370,6 +5426,14 @@
                 <w:lang w:val="en-ID" w:eastAsia="en-ID"/>
               </w:rPr>
             </w:pPr>
+            <w:r>
+              <w:rPr>
+                <w:rFonts w:ascii="Tahoma" w:eastAsia="Times New Roman" w:hAnsi="Tahoma" w:cs="Tahoma"/>
+                <w:color w:val="000000" w:themeColor="text1"/>
+                <w:lang w:val="en-ID" w:eastAsia="en-ID"/>
+              </w:rPr>
+              <w:t>All SRS section</w:t>
+            </w:r>
           </w:p>
         </w:tc>
       </w:tr>
@@ -5571,21 +5635,7 @@
         <w:rPr>
           <w:rFonts w:ascii="Tahoma" w:hAnsi="Tahoma" w:cs="Tahoma"/>
         </w:rPr>
-        <w:t xml:space="preserve"> situs web dan platform digital PT </w:t>
-      </w:r>
-      <w:proofErr w:type="spellStart"/>
-      <w:r>
-        <w:rPr>
-          <w:rFonts w:ascii="Tahoma" w:hAnsi="Tahoma" w:cs="Tahoma"/>
-        </w:rPr>
-        <w:t>Sinergi</w:t>
-      </w:r>
-      <w:proofErr w:type="spellEnd"/>
-      <w:r>
-        <w:rPr>
-          <w:rFonts w:ascii="Tahoma" w:hAnsi="Tahoma" w:cs="Tahoma"/>
-        </w:rPr>
-        <w:t xml:space="preserve"> Mitra Abadi Jaya yang </w:t>
+        <w:t xml:space="preserve"> situs web dan platform digital yang </w:t>
       </w:r>
       <w:proofErr w:type="spellStart"/>
       <w:r>
@@ -7450,21 +7500,7 @@
         <w:rPr>
           <w:rFonts w:ascii="Tahoma" w:hAnsi="Tahoma" w:cs="Tahoma"/>
         </w:rPr>
-        <w:t xml:space="preserve"> PT </w:t>
-      </w:r>
-      <w:proofErr w:type="spellStart"/>
-      <w:r>
-        <w:rPr>
-          <w:rFonts w:ascii="Tahoma" w:hAnsi="Tahoma" w:cs="Tahoma"/>
-        </w:rPr>
-        <w:t>Sinergi</w:t>
-      </w:r>
-      <w:proofErr w:type="spellEnd"/>
-      <w:r>
-        <w:rPr>
-          <w:rFonts w:ascii="Tahoma" w:hAnsi="Tahoma" w:cs="Tahoma"/>
-        </w:rPr>
-        <w:t xml:space="preserve"> Mitra Abadi Jaya: </w:t>
+        <w:t xml:space="preserve"> </w:t>
       </w:r>
       <w:r>
         <w:rPr>
@@ -7577,42 +7613,42 @@
           <w:rFonts w:ascii="Tahoma" w:hAnsi="Tahoma" w:cs="Tahoma"/>
           <w:b/>
         </w:rPr>
+        <w:t>Zynergy</w:t>
+      </w:r>
+      <w:proofErr w:type="spellEnd"/>
+      <w:r>
+        <w:rPr>
+          <w:rFonts w:ascii="Tahoma" w:hAnsi="Tahoma" w:cs="Tahoma"/>
+          <w:b/>
+        </w:rPr>
+        <w:t xml:space="preserve"> Apps</w:t>
+      </w:r>
+      <w:r>
+        <w:rPr>
+          <w:rFonts w:ascii="Tahoma" w:hAnsi="Tahoma" w:cs="Tahoma"/>
+        </w:rPr>
+        <w:t xml:space="preserve"> (</w:t>
+      </w:r>
+      <w:proofErr w:type="spellStart"/>
+      <w:r>
+        <w:rPr>
+          <w:rFonts w:ascii="Tahoma" w:hAnsi="Tahoma" w:cs="Tahoma"/>
+        </w:rPr>
+        <w:t>aplikasi</w:t>
+      </w:r>
+      <w:proofErr w:type="spellEnd"/>
+      <w:r>
+        <w:rPr>
+          <w:rFonts w:ascii="Tahoma" w:hAnsi="Tahoma" w:cs="Tahoma"/>
+        </w:rPr>
+        <w:t xml:space="preserve"> </w:t>
+      </w:r>
+      <w:proofErr w:type="spellStart"/>
+      <w:r>
+        <w:rPr>
+          <w:rFonts w:ascii="Tahoma" w:hAnsi="Tahoma" w:cs="Tahoma"/>
+        </w:rPr>
         <w:lastRenderedPageBreak/>
-        <w:t>Zynergy</w:t>
-      </w:r>
-      <w:proofErr w:type="spellEnd"/>
-      <w:r>
-        <w:rPr>
-          <w:rFonts w:ascii="Tahoma" w:hAnsi="Tahoma" w:cs="Tahoma"/>
-          <w:b/>
-        </w:rPr>
-        <w:t xml:space="preserve"> Apps</w:t>
-      </w:r>
-      <w:r>
-        <w:rPr>
-          <w:rFonts w:ascii="Tahoma" w:hAnsi="Tahoma" w:cs="Tahoma"/>
-        </w:rPr>
-        <w:t xml:space="preserve"> (</w:t>
-      </w:r>
-      <w:proofErr w:type="spellStart"/>
-      <w:r>
-        <w:rPr>
-          <w:rFonts w:ascii="Tahoma" w:hAnsi="Tahoma" w:cs="Tahoma"/>
-        </w:rPr>
-        <w:t>aplikasi</w:t>
-      </w:r>
-      <w:proofErr w:type="spellEnd"/>
-      <w:r>
-        <w:rPr>
-          <w:rFonts w:ascii="Tahoma" w:hAnsi="Tahoma" w:cs="Tahoma"/>
-        </w:rPr>
-        <w:t xml:space="preserve"> </w:t>
-      </w:r>
-      <w:proofErr w:type="spellStart"/>
-      <w:r>
-        <w:rPr>
-          <w:rFonts w:ascii="Tahoma" w:hAnsi="Tahoma" w:cs="Tahoma"/>
-        </w:rPr>
         <w:t>berlangganan</w:t>
       </w:r>
       <w:proofErr w:type="spellEnd"/>
@@ -15009,7 +15045,25 @@
                 <w:sz w:val="20"/>
                 <w:szCs w:val="20"/>
               </w:rPr>
-              <w:t>Beranda ( / )</w:t>
+              <w:t xml:space="preserve">Beranda </w:t>
+            </w:r>
+            <w:proofErr w:type="gramStart"/>
+            <w:r>
+              <w:rPr>
+                <w:rFonts w:ascii="Calibri" w:eastAsia="Calibri" w:hAnsi="Calibri" w:cs="Calibri"/>
+                <w:sz w:val="20"/>
+                <w:szCs w:val="20"/>
+              </w:rPr>
+              <w:t>( /</w:t>
+            </w:r>
+            <w:proofErr w:type="gramEnd"/>
+            <w:r>
+              <w:rPr>
+                <w:rFonts w:ascii="Calibri" w:eastAsia="Calibri" w:hAnsi="Calibri" w:cs="Calibri"/>
+                <w:sz w:val="20"/>
+                <w:szCs w:val="20"/>
+              </w:rPr>
+              <w:t xml:space="preserve"> )</w:t>
             </w:r>
           </w:p>
         </w:tc>
@@ -15182,8 +15236,18 @@
                 <w:sz w:val="20"/>
                 <w:szCs w:val="20"/>
               </w:rPr>
-              <w:t>Digitalin ( /digital )</w:t>
-            </w:r>
+              <w:t xml:space="preserve">Digitalin </w:t>
+            </w:r>
+            <w:proofErr w:type="gramStart"/>
+            <w:r>
+              <w:rPr>
+                <w:rFonts w:ascii="Calibri" w:eastAsia="Calibri" w:hAnsi="Calibri" w:cs="Calibri"/>
+                <w:sz w:val="20"/>
+                <w:szCs w:val="20"/>
+              </w:rPr>
+              <w:t>( /digital )</w:t>
+            </w:r>
+            <w:proofErr w:type="gramEnd"/>
           </w:p>
         </w:tc>
         <w:tc>
@@ -15463,8 +15527,18 @@
                 <w:sz w:val="20"/>
                 <w:szCs w:val="20"/>
               </w:rPr>
-              <w:t>Design ( /design )</w:t>
-            </w:r>
+              <w:t xml:space="preserve">Design </w:t>
+            </w:r>
+            <w:proofErr w:type="gramStart"/>
+            <w:r>
+              <w:rPr>
+                <w:rFonts w:ascii="Calibri" w:eastAsia="Calibri" w:hAnsi="Calibri" w:cs="Calibri"/>
+                <w:sz w:val="20"/>
+                <w:szCs w:val="20"/>
+              </w:rPr>
+              <w:t>( /design )</w:t>
+            </w:r>
+            <w:proofErr w:type="gramEnd"/>
           </w:p>
         </w:tc>
         <w:tc>
@@ -15610,26 +15684,46 @@
                 <w:sz w:val="20"/>
                 <w:szCs w:val="20"/>
               </w:rPr>
-              <w:t xml:space="preserve"> Fitur ( /</w:t>
-            </w:r>
-            <w:proofErr w:type="spellStart"/>
+              <w:t xml:space="preserve"> Fitur </w:t>
+            </w:r>
+            <w:proofErr w:type="gramStart"/>
             <w:r>
               <w:rPr>
                 <w:rFonts w:ascii="Calibri" w:eastAsia="Calibri" w:hAnsi="Calibri" w:cs="Calibri"/>
                 <w:sz w:val="20"/>
                 <w:szCs w:val="20"/>
               </w:rPr>
-              <w:t>racik-fitur</w:t>
-            </w:r>
-            <w:proofErr w:type="spellEnd"/>
+              <w:t>( /</w:t>
+            </w:r>
+            <w:proofErr w:type="spellStart"/>
+            <w:proofErr w:type="gramEnd"/>
             <w:r>
               <w:rPr>
                 <w:rFonts w:ascii="Calibri" w:eastAsia="Calibri" w:hAnsi="Calibri" w:cs="Calibri"/>
                 <w:sz w:val="20"/>
                 <w:szCs w:val="20"/>
               </w:rPr>
+              <w:t>racik-</w:t>
+            </w:r>
+            <w:proofErr w:type="gramStart"/>
+            <w:r>
+              <w:rPr>
+                <w:rFonts w:ascii="Calibri" w:eastAsia="Calibri" w:hAnsi="Calibri" w:cs="Calibri"/>
+                <w:sz w:val="20"/>
+                <w:szCs w:val="20"/>
+              </w:rPr>
+              <w:t>fitur</w:t>
+            </w:r>
+            <w:proofErr w:type="spellEnd"/>
+            <w:r>
+              <w:rPr>
+                <w:rFonts w:ascii="Calibri" w:eastAsia="Calibri" w:hAnsi="Calibri" w:cs="Calibri"/>
+                <w:sz w:val="20"/>
+                <w:szCs w:val="20"/>
+              </w:rPr>
               <w:t xml:space="preserve"> )</w:t>
             </w:r>
+            <w:proofErr w:type="gramEnd"/>
           </w:p>
         </w:tc>
         <w:tc>
@@ -15775,8 +15869,36 @@
                 <w:sz w:val="20"/>
                 <w:szCs w:val="20"/>
               </w:rPr>
-              <w:t>Brief Project ( /brief-project )</w:t>
-            </w:r>
+              <w:t xml:space="preserve">Brief Project </w:t>
+            </w:r>
+            <w:proofErr w:type="gramStart"/>
+            <w:r>
+              <w:rPr>
+                <w:rFonts w:ascii="Calibri" w:eastAsia="Calibri" w:hAnsi="Calibri" w:cs="Calibri"/>
+                <w:sz w:val="20"/>
+                <w:szCs w:val="20"/>
+              </w:rPr>
+              <w:t>( /</w:t>
+            </w:r>
+            <w:proofErr w:type="gramEnd"/>
+            <w:r>
+              <w:rPr>
+                <w:rFonts w:ascii="Calibri" w:eastAsia="Calibri" w:hAnsi="Calibri" w:cs="Calibri"/>
+                <w:sz w:val="20"/>
+                <w:szCs w:val="20"/>
+              </w:rPr>
+              <w:t>brief-</w:t>
+            </w:r>
+            <w:proofErr w:type="gramStart"/>
+            <w:r>
+              <w:rPr>
+                <w:rFonts w:ascii="Calibri" w:eastAsia="Calibri" w:hAnsi="Calibri" w:cs="Calibri"/>
+                <w:sz w:val="20"/>
+                <w:szCs w:val="20"/>
+              </w:rPr>
+              <w:t>project )</w:t>
+            </w:r>
+            <w:proofErr w:type="gramEnd"/>
           </w:p>
         </w:tc>
         <w:tc>
@@ -15976,26 +16098,36 @@
                 <w:sz w:val="20"/>
                 <w:szCs w:val="20"/>
               </w:rPr>
-              <w:t xml:space="preserve"> ( /</w:t>
-            </w:r>
-            <w:proofErr w:type="spellStart"/>
+              <w:t xml:space="preserve"> </w:t>
+            </w:r>
+            <w:proofErr w:type="gramStart"/>
             <w:r>
               <w:rPr>
                 <w:rFonts w:ascii="Calibri" w:eastAsia="Calibri" w:hAnsi="Calibri" w:cs="Calibri"/>
                 <w:sz w:val="20"/>
                 <w:szCs w:val="20"/>
               </w:rPr>
-              <w:t>portofolio</w:t>
-            </w:r>
-            <w:proofErr w:type="spellEnd"/>
+              <w:t>( /</w:t>
+            </w:r>
+            <w:proofErr w:type="spellStart"/>
             <w:r>
               <w:rPr>
                 <w:rFonts w:ascii="Calibri" w:eastAsia="Calibri" w:hAnsi="Calibri" w:cs="Calibri"/>
                 <w:sz w:val="20"/>
                 <w:szCs w:val="20"/>
               </w:rPr>
+              <w:t>portofolio</w:t>
+            </w:r>
+            <w:proofErr w:type="spellEnd"/>
+            <w:r>
+              <w:rPr>
+                <w:rFonts w:ascii="Calibri" w:eastAsia="Calibri" w:hAnsi="Calibri" w:cs="Calibri"/>
+                <w:sz w:val="20"/>
+                <w:szCs w:val="20"/>
+              </w:rPr>
               <w:t xml:space="preserve"> )</w:t>
             </w:r>
+            <w:proofErr w:type="gramEnd"/>
           </w:p>
         </w:tc>
         <w:tc>
@@ -16159,8 +16291,18 @@
                 <w:sz w:val="20"/>
                 <w:szCs w:val="20"/>
               </w:rPr>
-              <w:t>Blog ( /blog )</w:t>
-            </w:r>
+              <w:t xml:space="preserve">Blog </w:t>
+            </w:r>
+            <w:proofErr w:type="gramStart"/>
+            <w:r>
+              <w:rPr>
+                <w:rFonts w:ascii="Calibri" w:eastAsia="Calibri" w:hAnsi="Calibri" w:cs="Calibri"/>
+                <w:sz w:val="20"/>
+                <w:szCs w:val="20"/>
+              </w:rPr>
+              <w:t>( /blog )</w:t>
+            </w:r>
+            <w:proofErr w:type="gramEnd"/>
           </w:p>
         </w:tc>
         <w:tc>
@@ -16224,8 +16366,18 @@
                 <w:sz w:val="20"/>
                 <w:szCs w:val="20"/>
               </w:rPr>
-              <w:t>Supply ( /supply )</w:t>
-            </w:r>
+              <w:t xml:space="preserve">Supply </w:t>
+            </w:r>
+            <w:proofErr w:type="gramStart"/>
+            <w:r>
+              <w:rPr>
+                <w:rFonts w:ascii="Calibri" w:eastAsia="Calibri" w:hAnsi="Calibri" w:cs="Calibri"/>
+                <w:sz w:val="20"/>
+                <w:szCs w:val="20"/>
+              </w:rPr>
+              <w:t>( /supply )</w:t>
+            </w:r>
+            <w:proofErr w:type="gramEnd"/>
           </w:p>
         </w:tc>
         <w:tc>
@@ -16381,26 +16533,36 @@
                 <w:sz w:val="20"/>
                 <w:szCs w:val="20"/>
               </w:rPr>
-              <w:t xml:space="preserve"> ( /</w:t>
-            </w:r>
-            <w:proofErr w:type="spellStart"/>
+              <w:t xml:space="preserve"> </w:t>
+            </w:r>
+            <w:proofErr w:type="gramStart"/>
             <w:r>
               <w:rPr>
                 <w:rFonts w:ascii="Calibri" w:eastAsia="Calibri" w:hAnsi="Calibri" w:cs="Calibri"/>
                 <w:sz w:val="20"/>
                 <w:szCs w:val="20"/>
               </w:rPr>
-              <w:t>tentang</w:t>
-            </w:r>
-            <w:proofErr w:type="spellEnd"/>
+              <w:t>( /</w:t>
+            </w:r>
+            <w:proofErr w:type="spellStart"/>
             <w:r>
               <w:rPr>
                 <w:rFonts w:ascii="Calibri" w:eastAsia="Calibri" w:hAnsi="Calibri" w:cs="Calibri"/>
                 <w:sz w:val="20"/>
                 <w:szCs w:val="20"/>
               </w:rPr>
+              <w:t>tentang</w:t>
+            </w:r>
+            <w:proofErr w:type="spellEnd"/>
+            <w:r>
+              <w:rPr>
+                <w:rFonts w:ascii="Calibri" w:eastAsia="Calibri" w:hAnsi="Calibri" w:cs="Calibri"/>
+                <w:sz w:val="20"/>
+                <w:szCs w:val="20"/>
+              </w:rPr>
               <w:t xml:space="preserve"> )</w:t>
             </w:r>
+            <w:proofErr w:type="gramEnd"/>
           </w:p>
         </w:tc>
         <w:tc>
@@ -16538,8 +16700,18 @@
                 <w:sz w:val="20"/>
                 <w:szCs w:val="20"/>
               </w:rPr>
-              <w:t>Panel Admin ( /admin )</w:t>
-            </w:r>
+              <w:t xml:space="preserve">Panel Admin </w:t>
+            </w:r>
+            <w:proofErr w:type="gramStart"/>
+            <w:r>
+              <w:rPr>
+                <w:rFonts w:ascii="Calibri" w:eastAsia="Calibri" w:hAnsi="Calibri" w:cs="Calibri"/>
+                <w:sz w:val="20"/>
+                <w:szCs w:val="20"/>
+              </w:rPr>
+              <w:t>( /admin )</w:t>
+            </w:r>
+            <w:proofErr w:type="gramEnd"/>
           </w:p>
         </w:tc>
         <w:tc>
@@ -18633,7 +18805,21 @@
               <w:rPr>
                 <w:rFonts w:ascii="Tahoma" w:hAnsi="Tahoma" w:cs="Tahoma"/>
               </w:rPr>
-              <w:t>: sitemap.xml, robots.txt, meta OG/Twitter Card</w:t>
+              <w:t xml:space="preserve">: sitemap.xml, robots.txt, </w:t>
+            </w:r>
+            <w:proofErr w:type="gramStart"/>
+            <w:r>
+              <w:rPr>
+                <w:rFonts w:ascii="Tahoma" w:hAnsi="Tahoma" w:cs="Tahoma"/>
+              </w:rPr>
+              <w:t>meta OG</w:t>
+            </w:r>
+            <w:proofErr w:type="gramEnd"/>
+            <w:r>
+              <w:rPr>
+                <w:rFonts w:ascii="Tahoma" w:hAnsi="Tahoma" w:cs="Tahoma"/>
+              </w:rPr>
+              <w:t>/Twitter Card</w:t>
             </w:r>
           </w:p>
         </w:tc>
@@ -19538,21 +19724,7 @@
         <w:rPr>
           <w:rFonts w:ascii="Tahoma" w:hAnsi="Tahoma" w:cs="Tahoma"/>
         </w:rPr>
-        <w:t xml:space="preserve"> PT </w:t>
-      </w:r>
-      <w:proofErr w:type="spellStart"/>
-      <w:r>
-        <w:rPr>
-          <w:rFonts w:ascii="Tahoma" w:hAnsi="Tahoma" w:cs="Tahoma"/>
-        </w:rPr>
-        <w:t>Sinergi</w:t>
-      </w:r>
-      <w:proofErr w:type="spellEnd"/>
-      <w:r>
-        <w:rPr>
-          <w:rFonts w:ascii="Tahoma" w:hAnsi="Tahoma" w:cs="Tahoma"/>
-        </w:rPr>
-        <w:t xml:space="preserve"> Mitra Abadi Jaya dan </w:t>
+        <w:t xml:space="preserve"> </w:t>
       </w:r>
       <w:proofErr w:type="spellStart"/>
       <w:r>
@@ -23277,7 +23449,21 @@
               <w:rPr>
                 <w:rFonts w:ascii="Tahoma" w:hAnsi="Tahoma" w:cs="Tahoma"/>
               </w:rPr>
-              <w:t xml:space="preserve">, domain .my.id, </w:t>
+              <w:t xml:space="preserve">, </w:t>
+            </w:r>
+            <w:proofErr w:type="gramStart"/>
+            <w:r>
+              <w:rPr>
+                <w:rFonts w:ascii="Tahoma" w:hAnsi="Tahoma" w:cs="Tahoma"/>
+              </w:rPr>
+              <w:t>domain .</w:t>
+            </w:r>
+            <w:proofErr w:type="gramEnd"/>
+            <w:r>
+              <w:rPr>
+                <w:rFonts w:ascii="Tahoma" w:hAnsi="Tahoma" w:cs="Tahoma"/>
+              </w:rPr>
+              <w:t xml:space="preserve">my.id, </w:t>
             </w:r>
             <w:proofErr w:type="spellStart"/>
             <w:r>
@@ -23406,7 +23592,21 @@
               <w:rPr>
                 <w:rFonts w:ascii="Tahoma" w:hAnsi="Tahoma" w:cs="Tahoma"/>
               </w:rPr>
-              <w:t xml:space="preserve">+ domain .com/.id, </w:t>
+              <w:t xml:space="preserve">+ </w:t>
+            </w:r>
+            <w:proofErr w:type="gramStart"/>
+            <w:r>
+              <w:rPr>
+                <w:rFonts w:ascii="Tahoma" w:hAnsi="Tahoma" w:cs="Tahoma"/>
+              </w:rPr>
+              <w:t>domain .</w:t>
+            </w:r>
+            <w:proofErr w:type="gramEnd"/>
+            <w:r>
+              <w:rPr>
+                <w:rFonts w:ascii="Tahoma" w:hAnsi="Tahoma" w:cs="Tahoma"/>
+              </w:rPr>
+              <w:t xml:space="preserve">com/.id, </w:t>
             </w:r>
             <w:proofErr w:type="spellStart"/>
             <w:r>
@@ -35065,49 +35265,19 @@
         <w:rPr>
           <w:rFonts w:ascii="Tahoma" w:eastAsia="Calibri" w:hAnsi="Tahoma" w:cs="Tahoma"/>
         </w:rPr>
-        <w:t xml:space="preserve">, email, WhatsApp) </w:t>
-      </w:r>
-      <w:proofErr w:type="spellStart"/>
-      <w:r>
-        <w:rPr>
-          <w:rFonts w:ascii="Tahoma" w:eastAsia="Calibri" w:hAnsi="Tahoma" w:cs="Tahoma"/>
-        </w:rPr>
-        <w:t>sesuai</w:t>
-      </w:r>
-      <w:proofErr w:type="spellEnd"/>
-      <w:r>
-        <w:rPr>
-          <w:rFonts w:ascii="Tahoma" w:eastAsia="Calibri" w:hAnsi="Tahoma" w:cs="Tahoma"/>
-        </w:rPr>
-        <w:t xml:space="preserve"> data </w:t>
-      </w:r>
-      <w:proofErr w:type="spellStart"/>
-      <w:r>
-        <w:rPr>
-          <w:rFonts w:ascii="Tahoma" w:eastAsia="Calibri" w:hAnsi="Tahoma" w:cs="Tahoma"/>
-        </w:rPr>
-        <w:t>resmi</w:t>
-      </w:r>
-      <w:proofErr w:type="spellEnd"/>
-      <w:r>
-        <w:rPr>
-          <w:rFonts w:ascii="Tahoma" w:eastAsia="Calibri" w:hAnsi="Tahoma" w:cs="Tahoma"/>
-        </w:rPr>
-        <w:t xml:space="preserve"> PT </w:t>
-      </w:r>
-      <w:proofErr w:type="spellStart"/>
-      <w:r>
-        <w:rPr>
-          <w:rFonts w:ascii="Tahoma" w:eastAsia="Calibri" w:hAnsi="Tahoma" w:cs="Tahoma"/>
-        </w:rPr>
-        <w:t>Sinergi</w:t>
-      </w:r>
-      <w:proofErr w:type="spellEnd"/>
-      <w:r>
-        <w:rPr>
-          <w:rFonts w:ascii="Tahoma" w:eastAsia="Calibri" w:hAnsi="Tahoma" w:cs="Tahoma"/>
-        </w:rPr>
-        <w:t xml:space="preserve"> Mitra Abadi Jaya.</w:t>
+        <w:t>, email, WhatsApp</w:t>
+      </w:r>
+      <w:r>
+        <w:rPr>
+          <w:rFonts w:ascii="Tahoma" w:eastAsia="Calibri" w:hAnsi="Tahoma" w:cs="Tahoma"/>
+        </w:rPr>
+        <w:t>)</w:t>
+      </w:r>
+      <w:r>
+        <w:rPr>
+          <w:rFonts w:ascii="Tahoma" w:eastAsia="Calibri" w:hAnsi="Tahoma" w:cs="Tahoma"/>
+        </w:rPr>
+        <w:t>.</w:t>
       </w:r>
     </w:p>
     <w:p>
@@ -39005,7 +39175,6 @@
         <w:rPr>
           <w:rFonts w:ascii="Tahoma" w:hAnsi="Tahoma" w:cs="Tahoma"/>
         </w:rPr>
-        <w:lastRenderedPageBreak/>
         <w:t>Functional Requirements</w:t>
       </w:r>
       <w:bookmarkEnd w:id="70"/>
@@ -39149,6 +39318,7 @@
           <w:b/>
           <w:bCs/>
         </w:rPr>
+        <w:lastRenderedPageBreak/>
         <w:t xml:space="preserve">REQ-SEO-2: </w:t>
       </w:r>
       <w:proofErr w:type="spellStart"/>
@@ -40754,7 +40924,6 @@
               <w:rPr>
                 <w:rFonts w:ascii="Tahoma" w:hAnsi="Tahoma" w:cs="Tahoma"/>
               </w:rPr>
-              <w:lastRenderedPageBreak/>
               <w:t>PER-9</w:t>
             </w:r>
           </w:p>
@@ -43360,7 +43529,6 @@
           <w:rFonts w:ascii="Tahoma" w:hAnsi="Tahoma" w:cs="Tahoma"/>
           <w:color w:val="000000" w:themeColor="text1"/>
         </w:rPr>
-        <w:lastRenderedPageBreak/>
         <w:t>Software Quality Attributes</w:t>
       </w:r>
       <w:bookmarkEnd w:id="75"/>
@@ -43596,6 +43764,7 @@
               <w:rPr>
                 <w:rFonts w:ascii="Tahoma" w:hAnsi="Tahoma" w:cs="Tahoma"/>
               </w:rPr>
+              <w:lastRenderedPageBreak/>
               <w:t>QA-2</w:t>
             </w:r>
           </w:p>
@@ -44775,7 +44944,6 @@
           <w:rFonts w:ascii="Tahoma" w:hAnsi="Tahoma" w:cs="Tahoma"/>
           <w:color w:val="000000" w:themeColor="text1"/>
         </w:rPr>
-        <w:lastRenderedPageBreak/>
         <w:t>Business Rules</w:t>
       </w:r>
       <w:bookmarkEnd w:id="76"/>
@@ -45023,14 +45191,29 @@
         <w:rPr>
           <w:rFonts w:ascii="Tahoma" w:hAnsi="Tahoma" w:cs="Tahoma"/>
         </w:rPr>
-        <w:t xml:space="preserve">: Domain gratis: </w:t>
+        <w:t>: Domain gratis</w:t>
+      </w:r>
+      <w:proofErr w:type="gramStart"/>
+      <w:r>
+        <w:rPr>
+          <w:rFonts w:ascii="Tahoma" w:hAnsi="Tahoma" w:cs="Tahoma"/>
+        </w:rPr>
+        <w:t xml:space="preserve">: </w:t>
       </w:r>
       <w:r>
         <w:rPr>
           <w:rStyle w:val="CodeChar"/>
           <w:rFonts w:ascii="Tahoma" w:hAnsi="Tahoma" w:cs="Tahoma"/>
         </w:rPr>
-        <w:t>.my.id</w:t>
+        <w:t>.</w:t>
+      </w:r>
+      <w:proofErr w:type="gramEnd"/>
+      <w:r>
+        <w:rPr>
+          <w:rStyle w:val="CodeChar"/>
+          <w:rFonts w:ascii="Tahoma" w:hAnsi="Tahoma" w:cs="Tahoma"/>
+        </w:rPr>
+        <w:t>my.id</w:t>
       </w:r>
       <w:r>
         <w:rPr>
@@ -45123,6 +45306,7 @@
           <w:rFonts w:ascii="Tahoma" w:hAnsi="Tahoma" w:cs="Tahoma"/>
           <w:b/>
         </w:rPr>
+        <w:lastRenderedPageBreak/>
         <w:t>BR-3</w:t>
       </w:r>
       <w:r>

</xml_diff>